<commit_message>
feat: update CV assets and improve layout for better presentation
</commit_message>
<xml_diff>
--- a/Pdf_Cv/cv_emerson_reyes.docx
+++ b/Pdf_Cv/cv_emerson_reyes.docx
@@ -30,10 +30,10 @@
             </w:tcBorders>
             <w:shd w:fill="F8FAFC" w:val="clear"/>
             <w:tcMar>
-              <w:top w:type="dxa" w:w="300"/>
-              <w:left w:type="dxa" w:w="300"/>
-              <w:bottom w:type="dxa" w:w="300"/>
-              <w:right w:type="dxa" w:w="300"/>
+              <w:top w:type="dxa" w:w="200"/>
+              <w:left w:type="dxa" w:w="200"/>
+              <w:bottom w:type="dxa" w:w="200"/>
+              <w:right w:type="dxa" w:w="200"/>
             </w:tcMar>
           </w:tcPr>
           <w:p>
@@ -557,10 +557,10 @@
               <w:right w:val="none"/>
             </w:tcBorders>
             <w:tcMar>
-              <w:top w:type="dxa" w:w="300"/>
-              <w:left w:type="dxa" w:w="400"/>
-              <w:bottom w:type="dxa" w:w="300"/>
-              <w:right w:type="dxa" w:w="300"/>
+              <w:top w:type="dxa" w:w="200"/>
+              <w:left w:type="dxa" w:w="250"/>
+              <w:bottom w:type="dxa" w:w="200"/>
+              <w:right w:type="dxa" w:w="200"/>
             </w:tcMar>
           </w:tcPr>
           <w:p>
@@ -1202,7 +1202,7 @@
     </w:tbl>
     <w:sectPr>
       <w:pgSz w:w="11906" w:h="16838" w:orient="portrait"/>
-      <w:pgMar w:top="720" w:right="720" w:bottom="720" w:left="720" w:header="708" w:footer="708" w:gutter="0"/>
+      <w:pgMar w:top="360" w:right="360" w:bottom="360" w:left="360" w:header="708" w:footer="708" w:gutter="0"/>
       <w:pgNumType/>
       <w:docGrid w:linePitch="360"/>
     </w:sectPr>

</xml_diff>

<commit_message>
Update CV assets and improve formatting; add references section with contact details
</commit_message>
<xml_diff>
--- a/Pdf_Cv/cv_emerson_reyes.docx
+++ b/Pdf_Cv/cv_emerson_reyes.docx
@@ -546,6 +546,115 @@
               <w:t xml:space="preserve">• Pensamiento analítico</w:t>
             </w:r>
           </w:p>
+          <w:p>
+            <w:pPr>
+              <w:pBdr>
+                <w:bottom w:val="single" w:color="E2E8F0" w:sz="6" w:space="4"/>
+              </w:pBdr>
+              <w:spacing w:after="80" w:before="240"/>
+            </w:pPr>
+            <w:r>
+              <w:rPr>
+                <w:rFonts w:ascii="Arial" w:cs="Arial" w:eastAsia="Arial" w:hAnsi="Arial"/>
+                <w:b/>
+                <w:bCs/>
+                <w:color w:val="94A3B8"/>
+                <w:sz w:val="16"/>
+                <w:szCs w:val="16"/>
+              </w:rPr>
+              <w:t xml:space="preserve">REFERENCIAS</w:t>
+            </w:r>
+          </w:p>
+          <w:p>
+            <w:pPr>
+              <w:spacing w:after="30"/>
+            </w:pPr>
+            <w:r>
+              <w:rPr>
+                <w:rFonts w:ascii="Arial" w:cs="Arial" w:eastAsia="Arial" w:hAnsi="Arial"/>
+                <w:b/>
+                <w:bCs/>
+                <w:color w:val="0F172A"/>
+                <w:sz w:val="16"/>
+                <w:szCs w:val="16"/>
+              </w:rPr>
+              <w:t xml:space="preserve">Jesús Sánchez</w:t>
+            </w:r>
+          </w:p>
+          <w:p>
+            <w:pPr>
+              <w:spacing w:after="60"/>
+            </w:pPr>
+            <w:r>
+              <w:rPr>
+                <w:rFonts w:ascii="Arial" w:cs="Arial" w:eastAsia="Arial" w:hAnsi="Arial"/>
+                <w:color w:val="4B5563"/>
+                <w:sz w:val="15"/>
+                <w:szCs w:val="15"/>
+              </w:rPr>
+              <w:t xml:space="preserve">310 341 8641</w:t>
+            </w:r>
+          </w:p>
+          <w:p>
+            <w:pPr>
+              <w:spacing w:after="30"/>
+            </w:pPr>
+            <w:r>
+              <w:rPr>
+                <w:rFonts w:ascii="Arial" w:cs="Arial" w:eastAsia="Arial" w:hAnsi="Arial"/>
+                <w:b/>
+                <w:bCs/>
+                <w:color w:val="0F172A"/>
+                <w:sz w:val="16"/>
+                <w:szCs w:val="16"/>
+              </w:rPr>
+              <w:t xml:space="preserve">Johan A. Leguizamo</w:t>
+            </w:r>
+          </w:p>
+          <w:p>
+            <w:pPr>
+              <w:spacing w:after="60"/>
+            </w:pPr>
+            <w:r>
+              <w:rPr>
+                <w:rFonts w:ascii="Arial" w:cs="Arial" w:eastAsia="Arial" w:hAnsi="Arial"/>
+                <w:color w:val="4B5563"/>
+                <w:sz w:val="15"/>
+                <w:szCs w:val="15"/>
+              </w:rPr>
+              <w:t xml:space="preserve">320 452 4778</w:t>
+            </w:r>
+          </w:p>
+          <w:p>
+            <w:pPr>
+              <w:spacing w:after="30"/>
+            </w:pPr>
+            <w:r>
+              <w:rPr>
+                <w:rFonts w:ascii="Arial" w:cs="Arial" w:eastAsia="Arial" w:hAnsi="Arial"/>
+                <w:b/>
+                <w:bCs/>
+                <w:color w:val="0F172A"/>
+                <w:sz w:val="16"/>
+                <w:szCs w:val="16"/>
+              </w:rPr>
+              <w:t xml:space="preserve">Efrain Manotas</w:t>
+            </w:r>
+          </w:p>
+          <w:p>
+            <w:pPr>
+              <w:spacing w:after="60"/>
+            </w:pPr>
+            <w:r>
+              <w:rPr>
+                <w:rFonts w:ascii="Arial" w:cs="Arial" w:eastAsia="Arial" w:hAnsi="Arial"/>
+                <w:color w:val="4B5563"/>
+                <w:sz w:val="15"/>
+                <w:szCs w:val="15"/>
+              </w:rPr>
+              <w:t xml:space="preserve">300 782 7571</w:t>
+            </w:r>
+          </w:p>
         </w:tc>
         <w:tc>
           <w:tcPr>
@@ -998,7 +1107,7 @@
           </w:p>
           <w:p>
             <w:pPr>
-              <w:spacing w:after="80"/>
+              <w:spacing w:after="60"/>
             </w:pPr>
             <w:r>
               <w:rPr>
@@ -1014,8 +1123,8 @@
             <w:r>
               <w:rPr>
                 <w:color w:val="64748B"/>
-                <w:sz w:val="17"/>
-                <w:szCs w:val="17"/>
+                <w:sz w:val="16"/>
+                <w:szCs w:val="16"/>
               </w:rPr>
               <w:t xml:space="preserve"> — </w:t>
             </w:r>
@@ -1023,15 +1132,15 @@
               <w:rPr>
                 <w:rFonts w:ascii="Arial" w:cs="Arial" w:eastAsia="Arial" w:hAnsi="Arial"/>
                 <w:color w:val="4B5563"/>
-                <w:sz w:val="17"/>
-                <w:szCs w:val="17"/>
-              </w:rPr>
-              <w:t xml:space="preserve">Sistema administrativo de control de acceso con autenticación biométrica, JWT, dashboards, reportes y gestión de empleados.</w:t>
-            </w:r>
-          </w:p>
-          <w:p>
-            <w:pPr>
-              <w:spacing w:after="80"/>
+                <w:sz w:val="16"/>
+                <w:szCs w:val="16"/>
+              </w:rPr>
+              <w:t xml:space="preserve">Sistema de control de acceso con autenticación biométrica, JWT, dashboards y gestión de empleados.</w:t>
+            </w:r>
+          </w:p>
+          <w:p>
+            <w:pPr>
+              <w:spacing w:after="60"/>
             </w:pPr>
             <w:r>
               <w:rPr>
@@ -1042,13 +1151,46 @@
                 <w:sz w:val="17"/>
                 <w:szCs w:val="17"/>
               </w:rPr>
+              <w:t xml:space="preserve">DuoBalance</w:t>
+            </w:r>
+            <w:r>
+              <w:rPr>
+                <w:color w:val="64748B"/>
+                <w:sz w:val="16"/>
+                <w:szCs w:val="16"/>
+              </w:rPr>
+              <w:t xml:space="preserve"> — </w:t>
+            </w:r>
+            <w:r>
+              <w:rPr>
+                <w:rFonts w:ascii="Arial" w:cs="Arial" w:eastAsia="Arial" w:hAnsi="Arial"/>
+                <w:color w:val="4B5563"/>
+                <w:sz w:val="16"/>
+                <w:szCs w:val="16"/>
+              </w:rPr>
+              <w:t xml:space="preserve">Plataforma web y móvil para gestión y división de gastos compartidos con NestJS, PostgreSQL y React Native.</w:t>
+            </w:r>
+          </w:p>
+          <w:p>
+            <w:pPr>
+              <w:spacing w:after="60"/>
+            </w:pPr>
+            <w:r>
+              <w:rPr>
+                <w:rFonts w:ascii="Arial" w:cs="Arial" w:eastAsia="Arial" w:hAnsi="Arial"/>
+                <w:b/>
+                <w:bCs/>
+                <w:color w:val="0F172A"/>
+                <w:sz w:val="17"/>
+                <w:szCs w:val="17"/>
+              </w:rPr>
               <w:t xml:space="preserve">AlgoTrainer</w:t>
             </w:r>
             <w:r>
               <w:rPr>
                 <w:color w:val="64748B"/>
-                <w:sz w:val="17"/>
-                <w:szCs w:val="17"/>
+                <w:sz w:val="16"/>
+                <w:szCs w:val="16"/>
               </w:rPr>
               <w:t xml:space="preserve"> — </w:t>
             </w:r>
@@ -1056,15 +1198,15 @@
               <w:rPr>
                 <w:rFonts w:ascii="Arial" w:cs="Arial" w:eastAsia="Arial" w:hAnsi="Arial"/>
                 <w:color w:val="4B5563"/>
-                <w:sz w:val="17"/>
-                <w:szCs w:val="17"/>
-              </w:rPr>
-              <w:t xml:space="preserve">Plataforma interactiva de entrenamiento para speedcubers enfocada en reconocimiento y ejecución de algoritmos.</w:t>
-            </w:r>
-          </w:p>
-          <w:p>
-            <w:pPr>
-              <w:spacing w:after="80"/>
+                <w:sz w:val="16"/>
+                <w:szCs w:val="16"/>
+              </w:rPr>
+              <w:t xml:space="preserve">Plataforma de entrenamiento para speedcubers con reconocimiento y medición de algoritmos.</w:t>
+            </w:r>
+          </w:p>
+          <w:p>
+            <w:pPr>
+              <w:spacing w:after="60"/>
             </w:pPr>
             <w:r>
               <w:rPr>
@@ -1080,8 +1222,8 @@
             <w:r>
               <w:rPr>
                 <w:color w:val="64748B"/>
-                <w:sz w:val="17"/>
-                <w:szCs w:val="17"/>
+                <w:sz w:val="16"/>
+                <w:szCs w:val="16"/>
               </w:rPr>
               <w:t xml:space="preserve"> — </w:t>
             </w:r>
@@ -1089,15 +1231,15 @@
               <w:rPr>
                 <w:rFonts w:ascii="Arial" w:cs="Arial" w:eastAsia="Arial" w:hAnsi="Arial"/>
                 <w:color w:val="4B5563"/>
-                <w:sz w:val="17"/>
-                <w:szCs w:val="17"/>
-              </w:rPr>
-              <w:t xml:space="preserve">Plataforma web que conecta agricultores colombianos directamente con compradores de forma simple y accesible.</w:t>
-            </w:r>
-          </w:p>
-          <w:p>
-            <w:pPr>
-              <w:spacing w:after="80"/>
+                <w:sz w:val="16"/>
+                <w:szCs w:val="16"/>
+              </w:rPr>
+              <w:t xml:space="preserve">Plataforma agrotech que conecta agricultores directamente con compradores sin intermediarios.</w:t>
+            </w:r>
+          </w:p>
+          <w:p>
+            <w:pPr>
+              <w:spacing w:after="60"/>
             </w:pPr>
             <w:r>
               <w:rPr>
@@ -1113,8 +1255,8 @@
             <w:r>
               <w:rPr>
                 <w:color w:val="64748B"/>
-                <w:sz w:val="17"/>
-                <w:szCs w:val="17"/>
+                <w:sz w:val="16"/>
+                <w:szCs w:val="16"/>
               </w:rPr>
               <w:t xml:space="preserve"> — </w:t>
             </w:r>
@@ -1122,79 +1264,10 @@
               <w:rPr>
                 <w:rFonts w:ascii="Arial" w:cs="Arial" w:eastAsia="Arial" w:hAnsi="Arial"/>
                 <w:color w:val="4B5563"/>
-                <w:sz w:val="17"/>
-                <w:szCs w:val="17"/>
-              </w:rPr>
-              <w:t xml:space="preserve">Asistente inteligente para aprender inglés mediante IA con Telegram, reconocimiento de voz, TTS y diccionario inteligente.</w:t>
-            </w:r>
-          </w:p>
-          <w:p>
-            <w:pPr>
-              <w:pBdr>
-                <w:bottom w:val="single" w:color="E2E8F0" w:sz="6" w:space="4"/>
-              </w:pBdr>
-              <w:spacing w:after="120" w:before="260"/>
-            </w:pPr>
-            <w:r>
-              <w:rPr>
-                <w:rFonts w:ascii="Arial" w:cs="Arial" w:eastAsia="Arial" w:hAnsi="Arial"/>
-                <w:b/>
-                <w:bCs/>
-                <w:color w:val="64748B"/>
-                <w:sz w:val="18"/>
-                <w:szCs w:val="18"/>
-              </w:rPr>
-              <w:t xml:space="preserve">REFERENCIAS</w:t>
-            </w:r>
-          </w:p>
-          <w:p>
-            <w:pPr>
-              <w:spacing w:after="60"/>
-            </w:pPr>
-            <w:r>
-              <w:rPr>
-                <w:rFonts w:ascii="Arial" w:cs="Arial" w:eastAsia="Arial" w:hAnsi="Arial"/>
-                <w:b/>
-                <w:bCs/>
-                <w:color w:val="0F172A"/>
-                <w:sz w:val="18"/>
-                <w:szCs w:val="18"/>
-              </w:rPr>
-              <w:t xml:space="preserve">Jesús Sánchez</w:t>
-            </w:r>
-            <w:r>
-              <w:rPr>
-                <w:rFonts w:ascii="Arial" w:cs="Arial" w:eastAsia="Arial" w:hAnsi="Arial"/>
-                <w:color w:val="4B5563"/>
-                <w:sz w:val="17"/>
-                <w:szCs w:val="17"/>
-              </w:rPr>
-              <w:t xml:space="preserve">  ·  310 341 8641</w:t>
-            </w:r>
-          </w:p>
-          <w:p>
-            <w:pPr>
-              <w:spacing w:after="60"/>
-            </w:pPr>
-            <w:r>
-              <w:rPr>
-                <w:rFonts w:ascii="Arial" w:cs="Arial" w:eastAsia="Arial" w:hAnsi="Arial"/>
-                <w:b/>
-                <w:bCs/>
-                <w:color w:val="0F172A"/>
-                <w:sz w:val="18"/>
-                <w:szCs w:val="18"/>
-              </w:rPr>
-              <w:t xml:space="preserve">Johan A. Leguizamo</w:t>
-            </w:r>
-            <w:r>
-              <w:rPr>
-                <w:rFonts w:ascii="Arial" w:cs="Arial" w:eastAsia="Arial" w:hAnsi="Arial"/>
-                <w:color w:val="4B5563"/>
-                <w:sz w:val="17"/>
-                <w:szCs w:val="17"/>
-              </w:rPr>
-              <w:t xml:space="preserve">  ·  320 452 4778</w:t>
+                <w:sz w:val="16"/>
+                <w:szCs w:val="16"/>
+              </w:rPr>
+              <w:t xml:space="preserve">Asistente de IA para aprender inglés por Telegram con reconocimiento de voz, TTS y diccionario.</w:t>
             </w:r>
           </w:p>
         </w:tc>

</xml_diff>

<commit_message>
update CV content with project updates, refined profile, updated English certification level, and Docker integration mention
</commit_message>
<xml_diff>
--- a/Pdf_Cv/cv_emerson_reyes.docx
+++ b/Pdf_Cv/cv_emerson_reyes.docx
@@ -236,7 +236,7 @@
                 <w:sz w:val="16"/>
                 <w:szCs w:val="16"/>
               </w:rPr>
-              <w:t xml:space="preserve">B1 Certificado</w:t>
+              <w:t xml:space="preserve">A2 Certificado</w:t>
             </w:r>
           </w:p>
           <w:p>
@@ -702,7 +702,7 @@
                 <w:sz w:val="18"/>
                 <w:szCs w:val="18"/>
               </w:rPr>
-              <w:t xml:space="preserve">Tecnólogo en Análisis y Desarrollo de Software graduado del SENA, con más de 3 años de experiencia desarrollando proyectos de forma autónoma y práctica real en la Fábrica de Software del SENA. Inglés B1 certificado, con capacidad para leer documentación técnica y colaborar en entornos internacionales.</w:t>
+              <w:t xml:space="preserve">Tecnólogo en Análisis y Desarrollo de Software del SENA (2023–2026), con 6 meses de práctica laboral profesional en la Fábrica de Software del SENA (Abril – Octubre 2026) y desarrollo continuo de proyectos full stack autónomos desde 2023. Inglés A2 certificado, con capacidad para leer y asimilar documentación técnica.</w:t>
             </w:r>
           </w:p>
           <w:p>
@@ -716,7 +716,7 @@
                 <w:sz w:val="18"/>
                 <w:szCs w:val="18"/>
               </w:rPr>
-              <w:t xml:space="preserve">Apasionado por el desarrollo Full Stack, interfaces modernas, sistemas escalables y automatización. Experiencia construyendo aplicaciones web completas con tecnologías frontend y backend, integrando bases de datos, APIs REST, autenticación JWT y arquitecturas modernas.</w:t>
+              <w:t xml:space="preserve">Apasionado por el desarrollo Full Stack, interfaces modernas, sistemas escalables y automatización. Experiencia construyendo aplicaciones completas con React, React Native, NestJS, Spring Boot, PostgreSQL, Docker y APIs REST con JWT. Orientado al aprendizaje continuo, buenas prácticas de ingeniería y construcción de software de alto impacto.</w:t>
             </w:r>
           </w:p>
           <w:p>
@@ -751,7 +751,7 @@
                 <w:sz w:val="19"/>
                 <w:szCs w:val="19"/>
               </w:rPr>
-              <w:t xml:space="preserve">Desarrollador Full Stack — Proyectos Autónomos</w:t>
+              <w:t xml:space="preserve">Desarrollador Full Stack — Fábrica de Software SENA</w:t>
             </w:r>
             <w:r>
               <w:rPr>
@@ -762,7 +762,7 @@
                 <w:sz w:val="16"/>
                 <w:szCs w:val="16"/>
               </w:rPr>
-              <w:t xml:space="preserve">   (2022 – Actualidad)</w:t>
+              <w:t xml:space="preserve">   (Abril 2026 – Octubre 2026)</w:t>
             </w:r>
           </w:p>
           <w:p>
@@ -778,7 +778,7 @@
                 <w:sz w:val="16"/>
                 <w:szCs w:val="16"/>
               </w:rPr>
-              <w:t xml:space="preserve">Experiencia independiente · +3 años</w:t>
+              <w:t xml:space="preserve">Servicio Nacional de Aprendizaje · Práctica laboral (6 meses)</w:t>
             </w:r>
           </w:p>
           <w:p>
@@ -793,7 +793,7 @@
                 <w:sz w:val="17"/>
                 <w:szCs w:val="17"/>
               </w:rPr>
-              <w:t xml:space="preserve">• Desarrollo de aplicaciones web completas con React, TypeScript, TailwindCSS en frontend.</w:t>
+              <w:t xml:space="preserve">• Desarrollo de aplicaciones full stack con React, Spring Boot y PostgreSQL en proyectos reales del ecosistema SENA.</w:t>
             </w:r>
           </w:p>
           <w:p>
@@ -808,7 +808,7 @@
                 <w:sz w:val="17"/>
                 <w:szCs w:val="17"/>
               </w:rPr>
-              <w:t xml:space="preserve">• Construcción de APIs REST con Spring Boot, Node.js y autenticación JWT.</w:t>
+              <w:t xml:space="preserve">• Implementación de APIs REST seguras con autenticación JWT y control de acceso por roles.</w:t>
             </w:r>
           </w:p>
           <w:p>
@@ -823,7 +823,7 @@
                 <w:sz w:val="17"/>
                 <w:szCs w:val="17"/>
               </w:rPr>
-              <w:t xml:space="preserve">• Integración con bases de datos PostgreSQL y MySQL; diseño de esquemas relacionales.</w:t>
+              <w:t xml:space="preserve">• Trabajo colaborativo en equipo bajo metodología ágil Scrum y control de versiones con Git/GitHub.</w:t>
             </w:r>
           </w:p>
           <w:p>
@@ -838,22 +838,7 @@
                 <w:sz w:val="17"/>
                 <w:szCs w:val="17"/>
               </w:rPr>
-              <w:t xml:space="preserve">• Automatización de flujos y consumo de APIs externas e integración de modelos de IA.</w:t>
-            </w:r>
-          </w:p>
-          <w:p>
-            <w:pPr>
-              <w:spacing w:after="40"/>
-              <w:ind w:left="240"/>
-            </w:pPr>
-            <w:r>
-              <w:rPr>
-                <w:rFonts w:ascii="Arial" w:cs="Arial" w:eastAsia="Arial" w:hAnsi="Arial"/>
-                <w:color w:val="4B5563"/>
-                <w:sz w:val="17"/>
-                <w:szCs w:val="17"/>
-              </w:rPr>
-              <w:t xml:space="preserve">• Control de versiones con Git/GitHub y despliegue con Docker y entornos Linux.</w:t>
+              <w:t xml:space="preserve">• Análisis de requerimientos y modelado de arquitecturas de software.</w:t>
             </w:r>
           </w:p>
           <w:p>
@@ -874,7 +859,7 @@
                 <w:sz w:val="19"/>
                 <w:szCs w:val="19"/>
               </w:rPr>
-              <w:t xml:space="preserve">Desarrollador — Fábrica de Software SENA</w:t>
+              <w:t xml:space="preserve">Desarrollador Independiente — Proyectos Autónomos &amp; Open Source</w:t>
             </w:r>
             <w:r>
               <w:rPr>
@@ -885,7 +870,7 @@
                 <w:sz w:val="16"/>
                 <w:szCs w:val="16"/>
               </w:rPr>
-              <w:t xml:space="preserve">   (SENA)</w:t>
+              <w:t xml:space="preserve">   (2023 – Actualidad)</w:t>
             </w:r>
           </w:p>
           <w:p>
@@ -901,7 +886,7 @@
                 <w:sz w:val="16"/>
                 <w:szCs w:val="16"/>
               </w:rPr>
-              <w:t xml:space="preserve">Servicio Nacional de Aprendizaje · Práctica institucional</w:t>
+              <w:t xml:space="preserve">Proyectos personales y de estudio autónomo</w:t>
             </w:r>
           </w:p>
           <w:p>
@@ -916,7 +901,7 @@
                 <w:sz w:val="17"/>
                 <w:szCs w:val="17"/>
               </w:rPr>
-              <w:t xml:space="preserve">• Participación en proyectos reales dentro del ecosistema de desarrollo de la Fábrica de Software.</w:t>
+              <w:t xml:space="preserve">• Desarrollo de aplicaciones completas con React, React Native, TypeScript y TailwindCSS en frontend.</w:t>
             </w:r>
           </w:p>
           <w:p>
@@ -931,7 +916,7 @@
                 <w:sz w:val="17"/>
                 <w:szCs w:val="17"/>
               </w:rPr>
-              <w:t xml:space="preserve">• Aplicación de metodologías de análisis de requerimientos y documentación técnica.</w:t>
+              <w:t xml:space="preserve">• Construcción de APIs REST y microservicios con NestJS, Spring Boot, Node.js y autenticación JWT.</w:t>
             </w:r>
           </w:p>
           <w:p>
@@ -946,7 +931,37 @@
                 <w:sz w:val="17"/>
                 <w:szCs w:val="17"/>
               </w:rPr>
-              <w:t xml:space="preserve">• Trabajo colaborativo en equipo con estándares de desarrollo de software.</w:t>
+              <w:t xml:space="preserve">• Integración con bases de datos PostgreSQL y MySQL; diseño de esquemas con Prisma ORM.</w:t>
+            </w:r>
+          </w:p>
+          <w:p>
+            <w:pPr>
+              <w:spacing w:after="40"/>
+              <w:ind w:left="240"/>
+            </w:pPr>
+            <w:r>
+              <w:rPr>
+                <w:rFonts w:ascii="Arial" w:cs="Arial" w:eastAsia="Arial" w:hAnsi="Arial"/>
+                <w:color w:val="4B5563"/>
+                <w:sz w:val="17"/>
+                <w:szCs w:val="17"/>
+              </w:rPr>
+              <w:t xml:space="preserve">• Automatización de flujos y consumo de APIs externas e integración de modelos de IA.</w:t>
+            </w:r>
+          </w:p>
+          <w:p>
+            <w:pPr>
+              <w:spacing w:after="40"/>
+              <w:ind w:left="240"/>
+            </w:pPr>
+            <w:r>
+              <w:rPr>
+                <w:rFonts w:ascii="Arial" w:cs="Arial" w:eastAsia="Arial" w:hAnsi="Arial"/>
+                <w:color w:val="4B5563"/>
+                <w:sz w:val="17"/>
+                <w:szCs w:val="17"/>
+              </w:rPr>
+              <w:t xml:space="preserve">• Control de versiones con Git/GitHub y despliegue containerizado con Docker en Linux.</w:t>
             </w:r>
           </w:p>
           <w:p>
@@ -992,7 +1007,7 @@
                 <w:sz w:val="16"/>
                 <w:szCs w:val="16"/>
               </w:rPr>
-              <w:t xml:space="preserve">   (Graduado)</w:t>
+              <w:t xml:space="preserve">   (2023 – 2026)</w:t>
             </w:r>
           </w:p>
           <w:p>
@@ -1038,7 +1053,7 @@
                 <w:sz w:val="17"/>
                 <w:szCs w:val="17"/>
               </w:rPr>
-              <w:t xml:space="preserve">• Programación orientada a objetos y arquitectura de software.</w:t>
+              <w:t xml:space="preserve">• Programación orientada a objetos (Java) y arquitectura de software.</w:t>
             </w:r>
           </w:p>
           <w:p>
@@ -1068,7 +1083,7 @@
                 <w:sz w:val="17"/>
                 <w:szCs w:val="17"/>
               </w:rPr>
-              <w:t xml:space="preserve">• Construcción e integración de APIs REST.</w:t>
+              <w:t xml:space="preserve">• Construcción e integración de APIs REST con seguridad JWT.</w:t>
             </w:r>
           </w:p>
           <w:p>
@@ -1135,7 +1150,7 @@
                 <w:sz w:val="16"/>
                 <w:szCs w:val="16"/>
               </w:rPr>
-              <w:t xml:space="preserve">Sistema de control de acceso con autenticación biométrica, JWT, dashboards y gestión de empleados.</w:t>
+              <w:t xml:space="preserve">Sistema de control de acceso con autenticación biométrica y JWT. Stack: Spring Boot, React, PostgreSQL y Docker.</w:t>
             </w:r>
           </w:p>
           <w:p>
@@ -1168,7 +1183,7 @@
                 <w:sz w:val="16"/>
                 <w:szCs w:val="16"/>
               </w:rPr>
-              <w:t xml:space="preserve">Plataforma web y móvil para gestión y división de gastos compartidos con NestJS, PostgreSQL y React Native.</w:t>
+              <w:t xml:space="preserve">Plataforma móvil y web de división inteligente de gastos con algoritmos de saldo. Stack: NestJS, React Native y Prisma.</w:t>
             </w:r>
           </w:p>
           <w:p>
@@ -1184,6 +1199,39 @@
                 <w:sz w:val="17"/>
                 <w:szCs w:val="17"/>
               </w:rPr>
+              <w:t xml:space="preserve">HuertaDirecta</w:t>
+            </w:r>
+            <w:r>
+              <w:rPr>
+                <w:color w:val="64748B"/>
+                <w:sz w:val="16"/>
+                <w:szCs w:val="16"/>
+              </w:rPr>
+              <w:t xml:space="preserve"> — </w:t>
+            </w:r>
+            <w:r>
+              <w:rPr>
+                <w:rFonts w:ascii="Arial" w:cs="Arial" w:eastAsia="Arial" w:hAnsi="Arial"/>
+                <w:color w:val="4B5563"/>
+                <w:sz w:val="16"/>
+                <w:szCs w:val="16"/>
+              </w:rPr>
+              <w:t xml:space="preserve">Plataforma agrotech para venta directa sin intermediarios con inventario en tiempo real. Stack: React, Node.js y PostgreSQL.</w:t>
+            </w:r>
+          </w:p>
+          <w:p>
+            <w:pPr>
+              <w:spacing w:after="60"/>
+            </w:pPr>
+            <w:r>
+              <w:rPr>
+                <w:rFonts w:ascii="Arial" w:cs="Arial" w:eastAsia="Arial" w:hAnsi="Arial"/>
+                <w:b/>
+                <w:bCs/>
+                <w:color w:val="0F172A"/>
+                <w:sz w:val="17"/>
+                <w:szCs w:val="17"/>
+              </w:rPr>
               <w:t xml:space="preserve">AlgoTrainer</w:t>
             </w:r>
             <w:r>
@@ -1201,7 +1249,7 @@
                 <w:sz w:val="16"/>
                 <w:szCs w:val="16"/>
               </w:rPr>
-              <w:t xml:space="preserve">Plataforma de entrenamiento para speedcubers con reconocimiento y medición de algoritmos.</w:t>
+              <w:t xml:space="preserve">Entrenamiento interactivo para speedcubers con reconocimiento de algoritmos 3D. Stack: React, TypeScript y TailwindCSS.</w:t>
             </w:r>
           </w:p>
           <w:p>
@@ -1217,7 +1265,7 @@
                 <w:sz w:val="17"/>
                 <w:szCs w:val="17"/>
               </w:rPr>
-              <w:t xml:space="preserve">HuertaDirecta</w:t>
+              <w:t xml:space="preserve">Ainglo</w:t>
             </w:r>
             <w:r>
               <w:rPr>
@@ -1234,40 +1282,7 @@
                 <w:sz w:val="16"/>
                 <w:szCs w:val="16"/>
               </w:rPr>
-              <w:t xml:space="preserve">Plataforma agrotech que conecta agricultores directamente con compradores sin intermediarios.</w:t>
-            </w:r>
-          </w:p>
-          <w:p>
-            <w:pPr>
-              <w:spacing w:after="60"/>
-            </w:pPr>
-            <w:r>
-              <w:rPr>
-                <w:rFonts w:ascii="Arial" w:cs="Arial" w:eastAsia="Arial" w:hAnsi="Arial"/>
-                <w:b/>
-                <w:bCs/>
-                <w:color w:val="0F172A"/>
-                <w:sz w:val="17"/>
-                <w:szCs w:val="17"/>
-              </w:rPr>
-              <w:t xml:space="preserve">Ainglo</w:t>
-            </w:r>
-            <w:r>
-              <w:rPr>
-                <w:color w:val="64748B"/>
-                <w:sz w:val="16"/>
-                <w:szCs w:val="16"/>
-              </w:rPr>
-              <w:t xml:space="preserve"> — </w:t>
-            </w:r>
-            <w:r>
-              <w:rPr>
-                <w:rFonts w:ascii="Arial" w:cs="Arial" w:eastAsia="Arial" w:hAnsi="Arial"/>
-                <w:color w:val="4B5563"/>
-                <w:sz w:val="16"/>
-                <w:szCs w:val="16"/>
-              </w:rPr>
-              <w:t xml:space="preserve">Asistente de IA para aprender inglés por Telegram con reconocimiento de voz, TTS y diccionario.</w:t>
+              <w:t xml:space="preserve">Asistente de IA para aprendizaje de inglés por Telegram con TTS y análisis de voz. Stack: Python, Gemini API y SQLite.</w:t>
             </w:r>
           </w:p>
         </w:tc>

</xml_diff>